<commit_message>
Record what protocol version 3 does and does not say
Version 3 defines no protocol deviations either, so item 19c cannot be
closed by a cross-reference. It does give the withdrawal criteria, which
now sit in item 24a.
</commit_message>
<xml_diff>
--- a/suppl_material/SAP_checklist_RESOLVE_Swiss.docx
+++ b/suppl_material/SAP_checklist_RESOLVE_Swiss.docx
@@ -2589,7 +2589,7 @@
                 <w:color w:val="A00028"/>
                 <w:sz w:val="18"/>
               </w:rPr>
-              <w:t>Not covered. The SAP does not define protocol deviations. Either add a sentence or point to the protocol.</w:t>
+              <w:t>Not covered, and a cross-reference will not close it: protocol version 3 of 11 December 2025 defines no protocol deviations either. Its only mentions are that any departure from the statistical plan will be described in the final report (section 5.1) and that emergency deviations to protect participants may proceed without prior ethics approval (section 6.6). Neither is a definition for analysis reporting. A short definition in the SAP would close the item.</w:t>
             </w:r>
           </w:p>
         </w:tc>
@@ -3122,7 +3122,7 @@
               <w:rPr>
                 <w:sz w:val="18"/>
               </w:rPr>
-              <w:t>Section 2.1, p. 3, for practices; section 3.7, p. 21, for participants.</w:t>
+              <w:t>Section 2.1, p. 3, for practices; section 3.7, p. 21, for participants. The withdrawal criteria themselves are in protocol version 3, section 4.4: withdrawn consent, newly reported pregnancy, or a severe illness that prevents following study procedures.</w:t>
             </w:r>
           </w:p>
         </w:tc>

</xml_diff>

<commit_message>
Define protocol deviations and close checklist items 19c and 19d
Neither protocol version defines them, so the SAP does. Four kinds are
named, they are reported by arm and by practice, and none of them removes a
participant from the analysis, which follows the intention-to-treat
principle already stated in section 2.8.
</commit_message>
<xml_diff>
--- a/suppl_material/SAP_checklist_RESOLVE_Swiss.docx
+++ b/suppl_material/SAP_checklist_RESOLVE_Swiss.docx
@@ -2586,10 +2586,9 @@
             <w:r/>
             <w:r>
               <w:rPr>
-                <w:color w:val="A00028"/>
                 <w:sz w:val="18"/>
               </w:rPr>
-              <w:t>Not covered, and a cross-reference will not close it: protocol version 3 of 11 December 2025 defines no protocol deviations either. Its only mentions are that any departure from the statistical plan will be described in the final report (section 5.1) and that emergency deviations to protect participants may proceed without prior ethics approval (section 6.6). Neither is a definition for analysis reporting. A short definition in the SAP would close the item.</w:t>
+              <w:t>Section 3.8, p. 23. A protocol deviation is defined as any departure from the procedures of the trial protocol that affects a participant's eligibility, allocation or treatment.</w:t>
             </w:r>
           </w:p>
         </w:tc>
@@ -2655,10 +2654,9 @@
             <w:r/>
             <w:r>
               <w:rPr>
-                <w:color w:val="A00028"/>
                 <w:sz w:val="18"/>
               </w:rPr>
-              <w:t>Not covered, see 19c.</w:t>
+              <w:t>Section 3.8, p. 23. Four kinds are recorded: treatment in the unallocated arm, delivery by an untrained therapist, enrolment against the eligibility criteria, and a course of treatment well outside the planned 16 weeks. Reported by arm and by practice with reason and timing. No participant is excluded because of a deviation.</w:t>
             </w:r>
           </w:p>
         </w:tc>

</xml_diff>

<commit_message>
Close the last two document references in the checklist
The data management plan for the SNSF exists on the trial SharePoint, and a
trial master file with a defined table of contents is held by the sponsor.
Only the protocol DOI remains, and it arrives with publication.
</commit_message>
<xml_diff>
--- a/suppl_material/SAP_checklist_RESOLVE_Swiss.docx
+++ b/suppl_material/SAP_checklist_RESOLVE_Swiss.docx
@@ -4818,10 +4818,9 @@
             <w:r/>
             <w:r>
               <w:rPr>
-                <w:color w:val="A00028"/>
                 <w:sz w:val="18"/>
               </w:rPr>
-              <w:t>Not referenced. The trial has a data management plan held by the sponsor; add a pointer if required.</w:t>
+              <w:t>A data management plan for the funder exists (Swiss National Science Foundation, grant 220585) and is held with the trial documentation. Data handling as implemented is described in protocol version 3, section 8: REDCap as the electronic case report form, coded participant identifiers, an automatic audit trail and a source data list.</w:t>
             </w:r>
           </w:p>
         </w:tc>
@@ -4887,10 +4886,9 @@
             <w:r/>
             <w:r>
               <w:rPr>
-                <w:color w:val="A00028"/>
                 <w:sz w:val="18"/>
               </w:rPr>
-              <w:t>Not referenced, see 32b.</w:t>
+              <w:t>A trial master file is maintained by the sponsor, with a defined table of contents covering contact details, study team, regulatory documents and site files. There is no separate statistical master file: this analysis plan and the accompanying R repository serve that purpose, see the data and code availability statement, p. 24.</w:t>
             </w:r>
           </w:p>
         </w:tc>

</xml_diff>